<commit_message>
Add log diagnostics dashboard
</commit_message>
<xml_diff>
--- a/docs/final-report.docx
+++ b/docs/final-report.docx
@@ -379,7 +379,7 @@
           <w:b/>
           <w:sz w:val="26"/>
         </w:rPr>
-        <w:t>2.6 日志追踪与答辩展示中心</w:t>
+        <w:t>2.6 日志诊断与答辩展示中心</w:t>
       </w:r>
     </w:p>
     <w:p>
@@ -393,7 +393,7 @@
           <w:b w:val="0"/>
           <w:sz w:val="21"/>
         </w:rPr>
-        <w:t>系统保存 AI 调用日志、知识检索日志和处理轨迹。新增 /showcase 答辩展示中心，管理员登录后默认进入该页面，可集中展示系统主题、演示顺序、8 个已实现亮点、系统状态、兜底策略和关键页面入口。</w:t>
+        <w:t>系统保存 AI 调用日志、知识检索日志和处理轨迹。日志诊断中心聚合展示 AI 成功率、平均耗时、知识命中数量、去重命中文档、平均检索分数、会话轨迹步骤和高频命中文档，同时保留原始日志表格和轨迹时间线，方便答辩时证明系统可解释、可调试。新增 /showcase 答辩展示中心，管理员登录后默认进入该页面，可集中展示系统主题、演示顺序、8 个已实现亮点、系统状态、兜底策略和关键页面入口。</w:t>
       </w:r>
     </w:p>
     <w:p>
@@ -1324,7 +1324,7 @@
           <w:b w:val="0"/>
           <w:sz w:val="21"/>
         </w:rPr>
-        <w:t>前端采用 Vue 3、Vite、Pinia、Vue Router、Axios 和 Element Plus。页面包括登录注册、答辩展示中心、咨询工作台、系统总览、知识库、订单管理、人工工单、日志中心和 AI 测试。答辩展示中心采用白底、轻边框、留白和清晰层级，强调克制、精致和产品感。</w:t>
+        <w:t>前端采用 Vue 3、Vite、Pinia、Vue Router、Axios 和 Element Plus。页面包括登录注册、答辩展示中心、咨询工作台、系统总览、知识库、订单管理、人工工单、日志诊断中心和 AI 测试。答辩展示中心和日志诊断中心均采用白底、轻边框、留白和清晰层级，强调克制、精致和产品感。</w:t>
       </w:r>
     </w:p>
     <w:p>
@@ -1732,7 +1732,7 @@
           <w:b w:val="0"/>
           <w:sz w:val="21"/>
         </w:rPr>
-        <w:t>全链路接口烟测覆盖登录、注册、系统状态、AI 测试、知识库、订单售后、聊天、多轮追问、自动工单、日志和测试数据清理。浏览器烟测覆盖展示中心、咨询工作台、AI 测试、知识库、订单、工单和日志中心。</w:t>
+        <w:t>全链路接口烟测覆盖登录、注册、系统状态、AI 测试、知识库、订单售后、聊天、多轮追问、自动工单、日志和测试数据清理。浏览器烟测覆盖展示中心、咨询工作台、AI 测试、知识库、订单、工单和日志诊断中心。</w:t>
       </w:r>
     </w:p>
     <w:p>
@@ -1843,7 +1843,7 @@
           <w:b w:val="0"/>
           <w:sz w:val="21"/>
         </w:rPr>
-        <w:t>日志中心提供 AI 调用、检索和处理轨迹，便于证明系统可解释、可调试。</w:t>
+        <w:t>日志诊断中心提供 AI 调用、检索和处理轨迹，并聚合 AI 成功率、平均耗时、知识命中和会话步骤，便于证明系统可解释、可调试。</w:t>
       </w:r>
     </w:p>
     <w:p>
@@ -2038,7 +2038,7 @@
                 <w:b w:val="0"/>
                 <w:sz w:val="19"/>
               </w:rPr>
-              <w:t>实现登录注册、咨询工作台、展示中心、知识库、工单、日志和 AI 测试页面</w:t>
+              <w:t>实现登录注册、咨询工作台、展示中心、知识库、工单、日志诊断和 AI 测试页面</w:t>
             </w:r>
           </w:p>
         </w:tc>
@@ -2137,7 +2137,7 @@
           <w:b w:val="0"/>
           <w:sz w:val="21"/>
         </w:rPr>
-        <w:t>日志中心以表格和时间线为主，后续可增加意图分布、工单趋势、AI 成功率和平均响应时长等统计看板。</w:t>
+        <w:t>日志诊断中心已能展示 AI 成功率、平均耗时、知识命中和处理轨迹摘要，后续可继续扩展意图分布、工单趋势、客服处理时长和按日期聚合的趋势看板。</w:t>
       </w:r>
     </w:p>
     <w:p>

</xml_diff>